<commit_message>
Align Treasury (2021) wage-gap claims with the source article
- Drop unsupported 'hourly' qualifier on the 45% wage gap; note Arabs
  work 21 more hours monthly
- Detail the gap decomposition (education 25%, industry 20%, locality
  17%, parental income 12%, 35% unexplained) and stop equating the
  unexplained share with discrimination
- Fix in-text citation: journal name replaced with author name

Co-Authored-By: Claude Fable 5 <noreply@anthropic.com>
Claude-Session: https://claude.ai/code/session_01GZSKNQtvk9nJD8g6v3pdZV
</commit_message>
<xml_diff>
--- a/docs/policy-paper-revised-distress-description.docx
+++ b/docs/policy-paper-revised-distress-description.docx
@@ -2245,7 +2245,7 @@
         <w:rPr>
           <w:rtl/>
         </w:rPr>
-        <w:t>האוכלוסייה הערבית מהווה כחמישית מאוכלוסיית ישראל, אך פוטנציאל השתלבותה בשוק העבודה אינו ממומש. שיעור התעסוקה בקרב ערבים עומד על כ-48% בלבד, לעומת כ-60.8% בכלל האוכלוסייה (הלשכה המרכזית לסטטיסטיקה, 2023). גם במדד האבטלה הישיר ניכר פער עקבי: בשנת 2022 עמד שיעור הבלתי-מועסקים בקרב ערבים על 5.5% לעומת 3.5% בקרב יהודים, ועם פרוץ המלחמה שילש שיעור האבטלה בחברה הערבית את עצמו בתוך חודש (המכון הישראלי לדמוקרטיה, 2023; בנק ישראל, 2024ב). הפער אינו אחיד: בקרב נשים ערביות הבעיה המרכזית היא השתתפות נמוכה במיוחד בכוח העבודה (כ-28%), ואילו בקרב גברים ערבים הבעיה היא ריכוז בענפים שוליים, שכר נמוך ופגיעוּת גבוהה בעיתות משבר. פער השכר השעתי בין גברים ערבים לגברים יהודים לא-חרדים מגיע לכ-45% (משרד האוצר, 2021; OECD, 2023).</w:t>
+        <w:t>האוכלוסייה הערבית מהווה כחמישית מאוכלוסיית ישראל, אך פוטנציאל השתלבותה בשוק העבודה אינו ממומש. שיעור התעסוקה בקרב ערבים עומד על כ-48% בלבד, לעומת כ-60.8% בכלל האוכלוסייה (הלשכה המרכזית לסטטיסטיקה, 2023). גם במדד האבטלה הישיר ניכר פער עקבי: בשנת 2022 עמד שיעור הבלתי-מועסקים בקרב ערבים על 5.5% לעומת 3.5% בקרב יהודים, ועם פרוץ המלחמה שילש שיעור האבטלה בחברה הערבית את עצמו בתוך חודש (המכון הישראלי לדמוקרטיה, 2023; בנק ישראל, 2024ב). הפער אינו אחיד: בקרב נשים ערביות הבעיה המרכזית היא השתתפות נמוכה במיוחד בכוח העבודה (כ-28%), ואילו בקרב גברים ערבים הבעיה היא ריכוז בענפים שוליים, שכר נמוך ופגיעוּת גבוהה בעיתות משבר. פער השכר בין גברים ערבים לגברים יהודים לא-חרדים מגיע לכ-45%, אף שהגברים הערבים עובדים בממוצע 21 שעות יותר בחודש (משרד האוצר, 2021; OECD, 2023).</w:t>
       </w:r>
     </w:p>
     <w:p>
@@ -3564,7 +3564,7 @@
                 <w:szCs w:val="22"/>
                 <w:rtl/>
               </w:rPr>
-              <w:t>פער שכר שעתי (גברים)</w:t>
+              <w:t>פער שכר (גברים)</w:t>
             </w:r>
           </w:p>
         </w:tc>
@@ -3939,7 +3939,7 @@
         <w:rPr>
           <w:rtl/>
         </w:rPr>
-        <w:t>פערים בהישגים הלימודיים, בציוני הבחינה הפסיכומטרית ובתמהיל ההשכלה (במיוחד מקצועות ה-STEM) תורמים לפער התעסוקתי. גם כאשר רמת ההשכלה דומה, התשואה להשכלה בקרב ערבים נמוכה יותר. מחקר משרד האוצר (2021) מצא כי ההשכלה מסבירה רק כ-25% מפער השכר, וכ-35% מהפער נותרו בלתי-מוסברים, ממצא המצביע על קיומה של אפליה.</w:t>
+        <w:t>פערים בהישגים הלימודיים, בציוני הבחינה הפסיכומטרית ובתמהיל ההשכלה (במיוחד מקצועות ה-STEM) תורמים לפער התעסוקתי. גם כאשר רמת ההשכלה דומה, התשואה להשכלה בקרב ערבים נמוכה יותר, ופער השכר בין גברים בעלי רמת השכלה זהה עומד על כ-24% (משרד האוצר, 2021). מחקר משרד האוצר (2021) מצא כי ההשכלה מסבירה כ-25% מפער השכר, תמהיל ענפי התעסוקה כ-20%, מקום המגורים כ-17% והכנסת ההורים כ-12%, ואילו כ-35% מהפער נותרו בלתי-מוסברים. חוקרי האוצר קשרו חלק מרכיב זה להיעדר ביטחון אישי ולפשיעה ביישובים הערביים, ושאלת האפליה נדונה בהסבר ג' להלן.</w:t>
       </w:r>
     </w:p>
     <w:p>
@@ -3959,7 +3959,7 @@
         <w:rPr>
           <w:rtl/>
         </w:rPr>
-        <w:t>מחקרים מצביעים על אפליה ישירה ועקיפה כלפי עובדים ערבים, במיוחד בשלב ההעסקה, שבו קשה ביותר להוכיח אפליה במסגרת הליך משפטי. דוח אונו (2009) תיעד עמדות של מנהלי כוח אדם ותחושות אפליה גבוהות בקרב ערבים ב“מקצועות האיכות”. מחקרים עדכניים מאששים כי חלק מהותי מפער השכר הבלתי-מוסבר נובע מאפליה על רקע לאום (Forum for Social Economics, 2024).</w:t>
+        <w:t>מחקרים מצביעים על אפליה ישירה ועקיפה כלפי עובדים ערבים, במיוחד בשלב ההעסקה, שבו קשה ביותר להוכיח אפליה במסגרת הליך משפטי. דוח אונו (2009) תיעד עמדות של מנהלי כוח אדם ותחושות אפליה גבוהות בקרב ערבים ב“מקצועות האיכות”. מחקרים עדכניים מאששים כי חלק מהותי מפער השכר הבלתי-מוסבר נובע מאפליה על רקע לאום (Hadad Haj-Yahya, 2024).</w:t>
       </w:r>
     </w:p>
     <w:p>
@@ -8852,7 +8852,7 @@
                 <w:szCs w:val="22"/>
                 <w:rtl/>
               </w:rPr>
-              <w:t>פער שכר שעתי (גברים)</w:t>
+              <w:t>פער שכר (גברים)</w:t>
             </w:r>
           </w:p>
         </w:tc>

</xml_diff>

<commit_message>
Add 2019 Employment Service report as pre-crisis trend anchor
The overrepresentation of Arabs among registered jobseekers predates
COVID and the war: in 2019 non-Jewish unemployment claimants rose 14%
vs about 5% among Jews. Added the data point to the jobseekers
paragraph and the report to the reference list.

Co-Authored-By: Claude Fable 5 <noreply@anthropic.com>
Claude-Session: https://claude.ai/code/session_01GZSKNQtvk9nJD8g6v3pdZV
</commit_message>
<xml_diff>
--- a/docs/policy-paper-revised-distress-description.docx
+++ b/docs/policy-paper-revised-distress-description.docx
@@ -2365,7 +2365,7 @@
         <w:rPr>
           <w:rtl/>
         </w:rPr>
-        <w:t xml:space="preserve">נתוני דורשי העבודה של שירות התעסוקה מחזקים את התמונה, שכן הם מודדים ישירות את מי שמחפשים עבודה ואינם מוצאים אותה. חלקם של הערבים בקרב דורשי העבודה הרשומים עמד בינואר 2023 על 32%, בינואר 2024 על 29.7% ובינואר 2025 על 29.1%, שיעור גבוה בהרבה מחלקה של האוכלוסייה הערבית בגילי העבודה, העומד על כחמישית (שירות התעסוקה, 2025). הפער אינו מצטמצם לאורך זמן, ושיעור החזרה לעבודה בקרב דורשי עבודה ערבים נמוך במיוחד, ומכאן שגם משך האבטלה שלהם ארוך יותר (שירות התעסוקה, 2025). מגמה זו, של אבטלה גבוהה, ממושכת ומתרחבת, היא המחייבת טיפול מיידי של משרד העבודה.</w:t>
+        <w:t xml:space="preserve">נתוני דורשי העבודה של שירות התעסוקה מחזקים את התמונה, שכן הם מודדים ישירות את מי שמחפשים עבודה ואינם מוצאים אותה. הייצוג העודף של ערבים בקרב דורשי העבודה אינו תופעה חדשה: עוד בשנת 2019, שנת גאות בשוק העבודה, ציין שירות התעסוקה כי שיעור דורשי העבודה מהמגזר הערבי גבוה ממשקלם באוכלוסייה, וכי מספר תובעי קצבת האבטלה מהאוכלוסייה הלא-יהודית עלה באותה שנה בכ-14%, לעומת עלייה של כ-5% בלבד בקרב היהודים (שירות התעסוקה, 2019). חלקם של הערבים בקרב דורשי העבודה הרשומים עמד בינואר 2023 על 32%, בינואר 2024 על 29.7% ובינואר 2025 על 29.1%, שיעור גבוה בהרבה מחלקה של האוכלוסייה הערבית בגילי העבודה, העומד על כחמישית (שירות התעסוקה, 2025). הפער אינו מצטמצם לאורך זמן, ושיעור החזרה לעבודה בקרב דורשי עבודה ערבים נמוך במיוחד, ומכאן שגם משך האבטלה שלהם ארוך יותר (שירות התעסוקה, 2025). מגמה זו, של אבטלה גבוהה, ממושכת ומתרחבת, היא המחייבת טיפול מיידי של משרד העבודה.</w:t>
       </w:r>
     </w:p>
     <w:p>
@@ -7592,6 +7592,18 @@
           <w:t>קישור</w:t>
         </w:r>
       </w:hyperlink>
+    </w:p>
+    <w:p>
+      <w:pPr>
+        <w:spacing w:after="140" w:line="360" w:lineRule="auto"/>
+        <w:jc w:val="both"/>
+      </w:pPr>
+      <w:r>
+        <w:rPr>
+          <w:rtl/>
+        </w:rPr>
+        <w:t xml:space="preserve">שירות התעסוקה (2019). דוח סיכום שנת 2019: מגמות בשוק העבודה. שירות התעסוקה הישראלי.</w:t>
+      </w:r>
     </w:p>
     <w:p>
       <w:pPr>

</xml_diff>